<commit_message>
Project Oracle v0.0.17 - Yala Soar Brain Slice 1
</commit_message>
<xml_diff>
--- a/PROJECT_ORACLE_PROJECT_ORIGIN_AND_HANDOFF.docx
+++ b/PROJECT_ORACLE_PROJECT_ORIGIN_AND_HANDOFF.docx
@@ -116,12 +116,7 @@
         <ns0:jc ns0:val="center"/>
       </ns0:pPr>
       <ns0:r>
-        <ns0:rPr>
-          <ns0:rFonts ns0:ascii="Calibri" ns0:hAnsi="Calibri"/>
-          <ns0:color ns0:val="667085"/>
-          <ns0:sz ns0:val="20"/>
-        </ns0:rPr>
-        <ns0:t>August 1, 2026 • Concept Build 0</ns0:t>
+        <ns0:t>August 2026 • Current authority aligned through v0.0.17 candidate</ns0:t>
       </ns0:r>
     </ns0:p>
     <ns0:p>
@@ -177,26 +172,8 @@
             <ns0:shd ns0:fill="F4F6F9"/>
           </ns0:tcPr>
           <ns0:p>
-            <ns0:pPr>
-              <ns0:keepLines/>
-              <ns0:spacing ns0:before="40" ns0:after="40" ns0:line="288" ns0:lineRule="auto"/>
-            </ns0:pPr>
             <ns0:r>
-              <ns0:rPr>
-                <ns0:rFonts ns0:ascii="Calibri" ns0:hAnsi="Calibri"/>
-                <ns0:b/>
-                <ns0:color ns0:val="1F4D78"/>
-                <ns0:sz ns0:val="21"/>
-              </ns0:rPr>
-              <ns0:t xml:space="preserve">STATUS  Project Oracle is a separate project concept. This document establishes the idea and hands it into its own project folder. It does not authorise code, select an engine, or restart implementation work.</ns0:t>
-            </ns0:r>
-            <ns0:r>
-              <ns0:rPr>
-                <ns0:rFonts ns0:ascii="Calibri" ns0:hAnsi="Calibri"/>
-                <ns0:color ns0:val="111111"/>
-                <ns0:sz ns0:val="21"/>
-              </ns0:rPr>
-              <ns0:t/>
+              <ns0:t>STATUS  Project Oracle is an active standalone implementation. v0.0.17 is the approved feature build for Yala Soar Cognition, Monad canon, Oracle system authority, Gaia-created Time, and the native root executable. Derek Sparks remains final authority and manual acceptance is required before snapshot or Git closeout.</ns0:t>
             </ns0:r>
           </ns0:p>
         </ns0:tc>
@@ -614,17 +591,8 @@
             <ns0:vAlign ns0:val="center"/>
           </ns0:tcPr>
           <ns0:p>
-            <ns0:pPr>
-              <ns0:spacing ns0:after="0"/>
-            </ns0:pPr>
             <ns0:r>
-              <ns0:rPr>
-                <ns0:rFonts ns0:ascii="Calibri" ns0:hAnsi="Calibri"/>
-                <ns0:b ns0:val="0"/>
-                <ns0:color ns0:val="111111"/>
-                <ns0:sz ns0:val="20"/>
-              </ns0:rPr>
-              <ns0:t>Outside observer with optional influence, never direct control of an inhabitant</ns0:t>
+              <ns0:t>Derek / Oracle is the outside system author and observer, never an in-world resident or direct puppeteer of a mind.</ns0:t>
             </ns0:r>
           </ns0:p>
         </ns0:tc>
@@ -671,17 +639,8 @@
             <ns0:vAlign ns0:val="center"/>
           </ns0:tcPr>
           <ns0:p>
-            <ns0:pPr>
-              <ns0:spacing ns0:after="0"/>
-            </ns0:pPr>
             <ns0:r>
-              <ns0:rPr>
-                <ns0:rFonts ns0:ascii="Calibri" ns0:hAnsi="Calibri"/>
-                <ns0:b ns0:val="0"/>
-                <ns0:color ns0:val="111111"/>
-                <ns0:sz ns0:val="20"/>
-              </ns0:rPr>
-              <ns0:t>Reveal that reality is simulated and observe whether civilization collapses, adapts, transforms, or survives</ns0:t>
+              <ns0:t>Let autonomous minds and civilizations develop, then observe how they respond to whatever evidence or revelation Oracle actually introduces.</ns0:t>
             </ns0:r>
           </ns0:p>
         </ns0:tc>
@@ -829,12 +788,7 @@
     </ns0:p>
     <ns0:p>
       <ns0:r>
-        <ns0:rPr>
-          <ns0:rFonts ns0:ascii="Calibri" ns0:hAnsi="Calibri"/>
-          <ns0:i ns0:val="0"/>
-          <ns0:color ns0:val="111111"/>
-        </ns0:rPr>
-        <ns0:t>The human does not enter the world as a character. The human stands outside it as an observer who can let history run untouched or influence conditions through weather, resources, signs, messages, disasters, and eventually the truth about the world itself.</ns0:t>
+        <ns0:t>Derek / Oracle does not enter the world as a resident character. Oracle is the outside/system-level author represented by Project Oracle itself. Oracle can let history run untouched or influence conditions through lawful system interventions, while in-world beings still control their own domains and choices.</ns0:t>
       </ns0:r>
     </ns0:p>
     <ns0:p>
@@ -877,12 +831,7 @@
     </ns0:p>
     <ns0:p>
       <ns0:r>
-        <ns0:rPr>
-          <ns0:rFonts ns0:ascii="Calibri" ns0:hAnsi="Calibri"/>
-          <ns0:i ns0:val="0"/>
-          <ns0:color ns0:val="111111"/>
-        </ns0:rPr>
-        <ns0:t>The nearest simple comparison is WorldBox taken several levels deeper, with the systemic history of Dwarf Fortress, the individual-life depth sought by Creatures and The Sims, and the reality-questioning premise of The Matrix and The Truman Show. The Microverse-battery episode of Rick and Morty is another useful comparison: a creator builds an artificial universe whose inhabitants develop their own society while unknowingly serving an outside purpose. Project Oracle uses that unsettling idea as a question about autonomy and revelation, not as an approved energy mechanic. These are reference points, not a formula. Project Oracle's identity is the combination of individual minds, emergent civilization, repeated revelation experiments, and an autonomous in-world Oracle who may help the inhabitants for reasons she chooses.</ns0:t>
+        <ns0:t>The nearest simple comparison is WorldBox taken several levels deeper, with the systemic history of Dwarf Fortress, the individual-life depth sought by Creatures and The Sims, and the reality-questioning premise of The Matrix and The Truman Show. These are reference points, not a formula. Project Oracle's identity is the combination of individual minds, emergent civilization, repeated reality experiments, and an outside system-author layer that can observe or intervene without becoming an in-world NPC.</ns0:t>
       </ns0:r>
     </ns0:p>
     <ns0:p>
@@ -962,19 +911,7 @@
         </ns0:numPr>
       </ns0:pPr>
       <ns0:r>
-        <ns0:rPr>
-          <ns0:rFonts ns0:ascii="Calibri" ns0:hAnsi="Calibri"/>
-          <ns0:b/>
-          <ns0:color ns0:val="111111"/>
-        </ns0:rPr>
-        <ns0:t>The experiment can be interrogated.</ns0:t>
-      </ns0:r>
-      <ns0:r>
-        <ns0:rPr>
-          <ns0:rFonts ns0:ascii="Calibri" ns0:hAnsi="Calibri"/>
-          <ns0:color ns0:val="111111"/>
-        </ns0:rPr>
-        <ns0:t xml:space="preserve"> A trusted outside monitoring system explains causes, dependencies, turning points, and why a world survived or failed.</ns0:t>
+        <ns0:t>The experiment can be interrogated. The Oracle/system console explains causes, dependencies, turning points, and why a world survived or failed without pretending that those protected system facts are knowledge held by the inhabitants.</ns0:t>
       </ns0:r>
     </ns0:p>
     <ns0:p>
@@ -1036,12 +973,7 @@
     </ns0:p>
     <ns0:p>
       <ns0:r>
-        <ns0:rPr>
-          <ns0:rFonts ns0:ascii="Calibri" ns0:hAnsi="Calibri"/>
-          <ns0:i ns0:val="0"/>
-          <ns0:color ns0:val="111111"/>
-        </ns0:rPr>
-        <ns0:t>The inhabitants are not decorative non-player characters waiting for a human hero. They are the active agents who make history. The observer can create pressure or opportunity, but the inhabitants decide what those conditions mean and how to respond.</ns0:t>
+        <ns0:t>The inhabitants are not decorative non-player characters waiting for a human hero. They are the active agents who make history. Oracle may create pressure or opportunity through the system layer, but the inhabitants decide what those conditions mean and how to respond.</ns0:t>
       </ns0:r>
     </ns0:p>
     <ns0:tbl>
@@ -1910,19 +1842,7 @@
         </ns0:numPr>
       </ns0:pPr>
       <ns0:r>
-        <ns0:rPr>
-          <ns0:rFonts ns0:ascii="Calibri" ns0:hAnsi="Calibri"/>
-          <ns0:b/>
-          <ns0:color ns0:val="111111"/>
-        </ns0:rPr>
-        <ns0:t>Rebellion:</ns0:t>
-      </ns0:r>
-      <ns0:r>
-        <ns0:rPr>
-          <ns0:rFonts ns0:ascii="Calibri" ns0:hAnsi="Calibri"/>
-          <ns0:color ns0:val="111111"/>
-        </ns0:rPr>
-        <ns0:t xml:space="preserve"> Movements attempt to oppose, bargain with, escape, or expose the creator.</ns0:t>
+        <ns0:t>Rebellion: Movements may attempt to oppose, bargain with, escape, or expose whatever outside cause they believe exists after sufficient evidence reaches them.</ns0:t>
       </ns0:r>
     </ns0:p>
     <ns0:p>
@@ -2062,24 +1982,17 @@
       </ns0:pPr>
     </ns0:p>
     <ns0:p>
-      <ns0:bookmarkStart ns0:id="7" ns0:name="observer"/>
       <ns0:pPr>
         <ns0:pStyle ns0:val="Heading1"/>
         <ns0:pageBreakBefore ns0:val="0"/>
       </ns0:pPr>
       <ns0:r>
-        <ns0:t>6. The Outside Observer</ns0:t>
+        <ns0:t>6. Oracle / The Outside System Author</ns0:t>
       </ns0:r>
-      <ns0:bookmarkEnd ns0:id="7"/>
     </ns0:p>
     <ns0:p>
       <ns0:r>
-        <ns0:rPr>
-          <ns0:rFonts ns0:ascii="Calibri" ns0:hAnsi="Calibri"/>
-          <ns0:i ns0:val="0"/>
-          <ns0:color ns0:val="111111"/>
-        </ns0:rPr>
-        <ns0:t>The human user is not a conventional player and does not possess an avatar. The better term is observer, creator, or experimenter. The observer can remain silent or alter the world's conditions, but can never directly puppeteer an inhabitant.</ns0:t>
+        <ns0:t>Derek occupies the Oracle position for Project Oracle. Oracle is not a conventional player, avatar, or in-world resident. Oracle is the outside/system-level author represented by the program itself: the simulation machinery, world-law resolver, records, and Master Key authority that make the simulated reality possible.</ns0:t>
       </ns0:r>
     </ns0:p>
     <ns0:tbl>
@@ -2569,12 +2482,7 @@
     </ns0:p>
     <ns0:p>
       <ns0:r>
-        <ns0:rPr>
-          <ns0:rFonts ns0:ascii="Calibri" ns0:hAnsi="Calibri"/>
-          <ns0:i ns0:val="0"/>
-          <ns0:color ns0:val="111111"/>
-        </ns0:rPr>
-        <ns0:t>Intervention contaminates the experiment. That is not necessarily forbidden; it is part of what makes the observer's choices meaningful. Project Oracle must record exactly when, how, and why the observer interfered so later outcomes are not falsely attributed to the inhabitants alone.</ns0:t>
+        <ns0:t>Intervention contaminates the experiment. That is not necessarily forbidden; it is part of what makes Oracle's choices meaningful. Project Oracle must record exactly when, how, and why Oracle interfered so later outcomes are not falsely attributed to the inhabitants alone. A recipient learns only what the intervention actually reveals.</ns0:t>
       </ns0:r>
     </ns0:p>
     <ns0:p>
@@ -2635,86 +2543,21 @@
             <ns0:shd ns0:fill="E8EEF5"/>
           </ns0:tcPr>
           <ns0:p>
-            <ns0:pPr>
-              <ns0:keepLines/>
-              <ns0:spacing ns0:before="60" ns0:after="60" ns0:line="264" ns0:lineRule="auto"/>
-            </ns0:pPr>
             <ns0:r>
-              <ns0:rPr>
-                <ns0:rFonts ns0:ascii="Consolas" ns0:hAnsi="Consolas"/>
-                <ns0:color ns0:val="0B2545"/>
-                <ns0:sz ns0:val="18"/>
-              </ns0:rPr>
               <ns0:t>YEAR 184 — THE KINGDOM OF VALE FRACTURES</ns0:t>
               <ns0:br/>
-            </ns0:r>
-            <ns0:r>
-              <ns0:rPr>
-                <ns0:rFonts ns0:ascii="Consolas" ns0:hAnsi="Consolas"/>
-                <ns0:color ns0:val="0B2545"/>
-                <ns0:sz ns0:val="18"/>
-              </ns0:rPr>
               <ns0:br/>
-            </ns0:r>
-            <ns0:r>
-              <ns0:rPr>
-                <ns0:rFonts ns0:ascii="Consolas" ns0:hAnsi="Consolas"/>
-                <ns0:color ns0:val="0B2545"/>
-                <ns0:sz ns0:val="18"/>
-              </ns0:rPr>
               <ns0:t>Governor Mara rejects the Temple of the First Voice.</ns0:t>
               <ns0:br/>
-            </ns0:r>
-            <ns0:r>
-              <ns0:rPr>
-                <ns0:rFonts ns0:ascii="Consolas" ns0:hAnsi="Consolas"/>
-                <ns0:color ns0:val="0B2545"/>
-                <ns0:sz ns0:val="18"/>
-              </ns0:rPr>
               <ns0:t>Three northern provinces declare independence.</ns0:t>
               <ns0:br/>
-            </ns0:r>
-            <ns0:r>
-              <ns0:rPr>
-                <ns0:rFonts ns0:ascii="Consolas" ns0:hAnsi="Consolas"/>
-                <ns0:color ns0:val="0B2545"/>
-                <ns0:sz ns0:val="18"/>
-              </ns0:rPr>
-              <ns0:t>Priest Oren calls the eclipse a warning from the Creator.</ns0:t>
+              <ns0:t>Priest Oren calls the eclipse a warning from a god.</ns0:t>
               <ns0:br/>
-            </ns0:r>
-            <ns0:r>
-              <ns0:rPr>
-                <ns0:rFonts ns0:ascii="Consolas" ns0:hAnsi="Consolas"/>
-                <ns0:color ns0:val="0B2545"/>
-                <ns0:sz ns0:val="18"/>
-              </ns0:rPr>
               <ns0:t>Scholar Edrin discovers an exact law governing falling objects.</ns0:t>
               <ns0:br/>
-            </ns0:r>
-            <ns0:r>
-              <ns0:rPr>
-                <ns0:rFonts ns0:ascii="Consolas" ns0:hAnsi="Consolas"/>
-                <ns0:color ns0:val="0B2545"/>
-                <ns0:sz ns0:val="18"/>
-              </ns0:rPr>
               <ns0:t>12,441 inhabitants now believe their world was deliberately created.</ns0:t>
               <ns0:br/>
-            </ns0:r>
-            <ns0:r>
-              <ns0:rPr>
-                <ns0:rFonts ns0:ascii="Consolas" ns0:hAnsi="Consolas"/>
-                <ns0:color ns0:val="0B2545"/>
-                <ns0:sz ns0:val="18"/>
-              </ns0:rPr>
               <ns0:br/>
-            </ns0:r>
-            <ns0:r>
-              <ns0:rPr>
-                <ns0:rFonts ns0:ascii="Consolas" ns0:hAnsi="Consolas"/>
-                <ns0:color ns0:val="0B2545"/>
-                <ns0:sz ns0:val="18"/>
-              </ns0:rPr>
               <ns0:t>OBSERVER OPTIONS:  Observe  |  Inspect  |  Send Sign  |  Cause Disaster  |  Reveal Truth</ns0:t>
             </ns0:r>
           </ns0:p>
@@ -2737,24 +2580,17 @@
       </ns0:r>
     </ns0:p>
     <ns0:p>
-      <ns0:bookmarkStart ns0:id="9" ns0:name="oracle"/>
       <ns0:pPr>
         <ns0:pStyle ns0:val="Heading1"/>
         <ns0:pageBreakBefore ns0:val="0"/>
       </ns0:pPr>
       <ns0:r>
-        <ns0:t>8. The Oracle Inside the World</ns0:t>
+        <ns0:t>8. Oracle as the System Layer</ns0:t>
       </ns0:r>
-      <ns0:bookmarkEnd ns0:id="9"/>
     </ns0:p>
     <ns0:p>
       <ns0:r>
-        <ns0:rPr>
-          <ns0:rFonts ns0:ascii="Calibri" ns0:hAnsi="Calibri"/>
-          <ns0:i ns0:val="0"/>
-          <ns0:color ns0:val="111111"/>
-        </ns0:rPr>
-        <ns0:t>Project Oracle includes an autonomous female Oracle inside the simulated world, closer in role and spirit to the Oracle in The Matrix. She is not the experiment's measuring instrument and she is not a mouthpiece that must repeat whatever the outside observer wants. She has agency. She may understand the world's patterns, its people, and perhaps portions of its underlying laws more deeply than other inhabitants do.</ns0:t>
+        <ns0:t>Project Oracle does not contain a separate autonomous Oracle character inside the simulated world. Oracle is the system-author layer itself. The world contains Monad, Wisdom, Yala, and whatever beings later arise through actual history; Oracle is not another resident beside them.</ns0:t>
       </ns0:r>
     </ns0:p>
     <ns0:tbl>
@@ -2794,26 +2630,8 @@
             <ns0:shd ns0:fill="F4F6F9"/>
           </ns0:tcPr>
           <ns0:p>
-            <ns0:pPr>
-              <ns0:keepLines/>
-              <ns0:spacing ns0:before="40" ns0:after="40" ns0:line="288" ns0:lineRule="auto"/>
-            </ns0:pPr>
             <ns0:r>
-              <ns0:rPr>
-                <ns0:rFonts ns0:ascii="Calibri" ns0:hAnsi="Calibri"/>
-                <ns0:b/>
-                <ns0:color ns0:val="1F4D78"/>
-                <ns0:sz ns0:val="21"/>
-              </ns0:rPr>
-              <ns0:t xml:space="preserve">ORACLE AGENCY RULE  </ns0:t>
-            </ns0:r>
-            <ns0:r>
-              <ns0:rPr>
-                <ns0:rFonts ns0:ascii="Calibri" ns0:hAnsi="Calibri"/>
-                <ns0:color ns0:val="111111"/>
-                <ns0:sz ns0:val="21"/>
-              </ns0:rPr>
-              <ns0:t>The in-world Oracle may help inhabitants for reasons she chooses. She decides whom to help, what guidance to offer, how directly to speak, and what purpose she believes that help serves. Her choices belong to the simulation and may affect whether a civilization survives the revelation.</ns0:t>
+              <ns0:t>ORACLE SYSTEM RULE  Oracle is not an in-world resident. Oracle is Project Oracle itself: the outside/system-level author with hidden Master Key authority. No inhabitant knows Oracle exists unless Oracle deliberately reveals that truth. A manifestation is perceived only as the form or event actually presented.</ns0:t>
             </ns0:r>
           </ns0:p>
         </ns0:tc>
@@ -2832,19 +2650,7 @@
         </ns0:numPr>
       </ns0:pPr>
       <ns0:r>
-        <ns0:rPr>
-          <ns0:rFonts ns0:ascii="Calibri" ns0:hAnsi="Calibri"/>
-          <ns0:b/>
-          <ns0:color ns0:val="111111"/>
-        </ns0:rPr>
-        <ns0:t>Lives inside the experiment:</ns0:t>
-      </ns0:r>
-      <ns0:r>
-        <ns0:rPr>
-          <ns0:rFonts ns0:ascii="Calibri" ns0:hAnsi="Calibri"/>
-          <ns0:color ns0:val="111111"/>
-        </ns0:rPr>
-        <ns0:t xml:space="preserve"> She is part of the world and its unfolding history, not an outside user interface.</ns0:t>
+        <ns0:t>Outside the resident entity list: Oracle is represented by Project Oracle's code, system interface, world-law authority, protected records, and intervention pathway rather than by a body in WorldState.</ns0:t>
       </ns0:r>
     </ns0:p>
     <ns0:p>
@@ -2855,19 +2661,7 @@
         </ns0:numPr>
       </ns0:pPr>
       <ns0:r>
-        <ns0:rPr>
-          <ns0:rFonts ns0:ascii="Calibri" ns0:hAnsi="Calibri"/>
-          <ns0:b/>
-          <ns0:color ns0:val="111111"/>
-        </ns0:rPr>
-        <ns0:t>Chooses her purpose:</ns0:t>
-      </ns0:r>
-      <ns0:r>
-        <ns0:rPr>
-          <ns0:rFonts ns0:ascii="Calibri" ns0:hAnsi="Calibri"/>
-          <ns0:color ns0:val="111111"/>
-        </ns0:rPr>
-        <ns0:t xml:space="preserve"> Her reasons for helping may be personal, philosophical, protective, strategic, mysterious, or shaped by her own history.</ns0:t>
+        <ns0:t>Master Key authority: Oracle has the Master Key because Oracle wrote the simulation and its locks. The Master Key is system access, not an in-world object waiting to be discovered.</ns0:t>
       </ns0:r>
     </ns0:p>
     <ns0:p>
@@ -2878,19 +2672,7 @@
         </ns0:numPr>
       </ns0:pPr>
       <ns0:r>
-        <ns0:rPr>
-          <ns0:rFonts ns0:ascii="Calibri" ns0:hAnsi="Calibri"/>
-          <ns0:b/>
-          <ns0:color ns0:val="111111"/>
-        </ns0:rPr>
-        <ns0:t>Guides without puppeteering:</ns0:t>
-      </ns0:r>
-      <ns0:r>
-        <ns0:rPr>
-          <ns0:rFonts ns0:ascii="Calibri" ns0:hAnsi="Calibri"/>
-          <ns0:color ns0:val="111111"/>
-        </ns0:rPr>
-        <ns0:t xml:space="preserve"> She may advise, warn, teach, test, conceal, or reveal, but other inhabitants still choose what to do.</ns0:t>
+        <ns0:t>Hidden identity: No in-world being knows Oracle exists unless Oracle deliberately reveals that truth. An unexplained voice remains an unexplained voice; a manifested form is perceived as that form.</ns0:t>
       </ns0:r>
     </ns0:p>
     <ns0:p>
@@ -2901,19 +2683,7 @@
         </ns0:numPr>
       </ns0:pPr>
       <ns0:r>
-        <ns0:rPr>
-          <ns0:rFonts ns0:ascii="Calibri" ns0:hAnsi="Calibri"/>
-          <ns0:b/>
-          <ns0:color ns0:val="111111"/>
-        </ns0:rPr>
-        <ns0:t>Can alter history:</ns0:t>
-      </ns0:r>
-      <ns0:r>
-        <ns0:rPr>
-          <ns0:rFonts ns0:ascii="Calibri" ns0:hAnsi="Calibri"/>
-          <ns0:color ns0:val="111111"/>
-        </ns0:rPr>
-        <ns0:t xml:space="preserve"> Her intervention may produce a hero, prevent a collapse, cause unintended consequences, or fail completely.</ns0:t>
+        <ns0:t>Manifestation without fixed form: Oracle has no permanent in-world body and may manifest in whatever form a particular intervention requires.</ns0:t>
       </ns0:r>
     </ns0:p>
     <ns0:p>
@@ -2924,19 +2694,7 @@
         </ns0:numPr>
       </ns0:pPr>
       <ns0:r>
-        <ns0:rPr>
-          <ns0:rFonts ns0:ascii="Calibri" ns0:hAnsi="Calibri"/>
-          <ns0:b/>
-          <ns0:color ns0:val="111111"/>
-        </ns0:rPr>
-        <ns0:t>Is not guaranteed obedience:</ns0:t>
-      </ns0:r>
-      <ns0:r>
-        <ns0:rPr>
-          <ns0:rFonts ns0:ascii="Calibri" ns0:hAnsi="Calibri"/>
-          <ns0:color ns0:val="111111"/>
-        </ns0:rPr>
-        <ns0:t xml:space="preserve"> She does not have to serve the outside observer, the government, a religion, or any supposed chosen one.</ns0:t>
+        <ns0:t>Eden reference: Oracle manifested in the form of a clever serpent. Eve knew only the clever serpent and was never told Oracle's true identity. The serpent was a manifestation, not Oracle's permanent form or species.</ns0:t>
       </ns0:r>
     </ns0:p>
     <ns0:p>
@@ -2947,29 +2705,12 @@
         </ns0:numPr>
       </ns0:pPr>
       <ns0:r>
-        <ns0:rPr>
-          <ns0:rFonts ns0:ascii="Calibri" ns0:hAnsi="Calibri"/>
-          <ns0:b/>
-          <ns0:color ns0:val="111111"/>
-        </ns0:rPr>
-        <ns0:t>Remains part of the evidence:</ns0:t>
-      </ns0:r>
-      <ns0:r>
-        <ns0:rPr>
-          <ns0:rFonts ns0:ascii="Calibri" ns0:hAnsi="Calibri"/>
-          <ns0:color ns0:val="111111"/>
-        </ns0:rPr>
-        <ns0:t xml:space="preserve"> The experiment records her actions and consequences just as it records every other inhabitant's choices.</ns0:t>
+        <ns0:t>Recorded intervention: Oracle Record preserves protected system truth and causal provenance, while World Record preserves settled in-world history without leaking hidden Oracle identity into resident knowledge.</ns0:t>
       </ns0:r>
     </ns0:p>
     <ns0:p>
       <ns0:r>
-        <ns0:rPr>
-          <ns0:rFonts ns0:ascii="Calibri" ns0:hAnsi="Calibri"/>
-          <ns0:i ns0:val="0"/>
-          <ns0:color ns0:val="111111"/>
-        </ns0:rPr>
-        <ns0:t>A separate trusted experiment monitor outside the world records state, interventions, causal chains, comparisons, uncertainty, and safety boundaries. That monitor must remain dependable because it measures the experiment; it is not the in-world Oracle character.</ns0:t>
+        <ns0:t>The Oracle/system layer must remain dependable because it measures and resolves the experiment. In-world minds may be mistaken, deceptive, limited, or self-aggrandising; Oracle records must distinguish their beliefs from system truth.</ns0:t>
       </ns0:r>
     </ns0:p>
     <ns0:p>
@@ -3145,52 +2886,15 @@
             <ns0:shd ns0:fill="E8EEF5"/>
           </ns0:tcPr>
           <ns0:p>
-            <ns0:pPr>
-              <ns0:keepLines/>
-              <ns0:spacing ns0:before="60" ns0:after="60" ns0:line="264" ns0:lineRule="auto"/>
-            </ns0:pPr>
             <ns0:r>
-              <ns0:rPr>
-                <ns0:rFonts ns0:ascii="Consolas" ns0:hAnsi="Consolas"/>
-                <ns0:color ns0:val="0B2545"/>
-                <ns0:sz ns0:val="18"/>
-              </ns0:rPr>
               <ns0:t>SIMULATION 0042 — COLLAPSED: religious war after revelation</ns0:t>
               <ns0:br/>
-            </ns0:r>
-            <ns0:r>
-              <ns0:rPr>
-                <ns0:rFonts ns0:ascii="Consolas" ns0:hAnsi="Consolas"/>
-                <ns0:color ns0:val="0B2545"/>
-                <ns0:sz ns0:val="18"/>
-              </ns0:rPr>
               <ns0:t>SIMULATION 0187 — COLLAPSED: reality-testing destroyed food infrastructure</ns0:t>
               <ns0:br/>
-            </ns0:r>
-            <ns0:r>
-              <ns0:rPr>
-                <ns0:rFonts ns0:ascii="Consolas" ns0:hAnsi="Consolas"/>
-                <ns0:color ns0:val="0B2545"/>
-                <ns0:sz ns0:val="18"/>
-              </ns0:rPr>
               <ns0:t>SIMULATION 0631 — COLLAPSED: government concealed proof and lost legitimacy</ns0:t>
               <ns0:br/>
-            </ns0:r>
-            <ns0:r>
-              <ns0:rPr>
-                <ns0:rFonts ns0:ascii="Consolas" ns0:hAnsi="Consolas"/>
-                <ns0:color ns0:val="0B2545"/>
-                <ns0:sz ns0:val="18"/>
-              </ns0:rPr>
-              <ns0:t>SIMULATION 1294 — COLLAPSED: creator intervention produced total dependency</ns0:t>
+              <ns0:t>SIMULATION 1294 — COLLAPSED: outside intervention produced total dependency</ns0:t>
               <ns0:br/>
-            </ns0:r>
-            <ns0:r>
-              <ns0:rPr>
-                <ns0:rFonts ns0:ascii="Consolas" ns0:hAnsi="Consolas"/>
-                <ns0:color ns0:val="0B2545"/>
-                <ns0:sz ns0:val="18"/>
-              </ns0:rPr>
               <ns0:t>SIMULATION 2841 — CONTINUING: civilization accepted the truth and retained agency</ns0:t>
             </ns0:r>
           </ns0:p>
@@ -3301,11 +3005,7 @@
         </ns0:numPr>
       </ns0:pPr>
       <ns0:r>
-        <ns0:rPr>
-          <ns0:rFonts ns0:ascii="Calibri" ns0:hAnsi="Calibri"/>
-          <ns0:color ns0:val="111111"/>
-        </ns0:rPr>
-        <ns0:t>A prophet accurately carries an outside message but later rejects the creator's intentions.</ns0:t>
+        <ns0:t>A prophet accurately carries an outside message but later rejects Oracle's apparent intentions without knowing Oracle's true identity.</ns0:t>
       </ns0:r>
     </ns0:p>
     <ns0:p>
@@ -3340,33 +3040,21 @@
     </ns0:p>
     <ns0:p>
       <ns0:r>
-        <ns0:rPr>
-          <ns0:rFonts ns0:ascii="Calibri" ns0:hAnsi="Calibri"/>
-          <ns0:i ns0:val="0"/>
-          <ns0:color ns0:val="111111"/>
-        </ns0:rPr>
-        <ns0:t>The most interesting figure may oppose the observer. Project Oracle is not an obedience simulator. A civilization that calmly rejects the creator's authority while preserving truth, agency, and life may have understood the experiment better than one that worships every intervention.</ns0:t>
+        <ns0:t>The most interesting figure may oppose whatever outside cause it believes exists. Project Oracle is not an obedience simulator. A civilization that calmly rejects apparent outside authority while preserving truth, agency, and life may have understood the experiment better than one that worships every intervention.</ns0:t>
       </ns0:r>
     </ns0:p>
     <ns0:p>
-      <ns0:bookmarkStart ns0:id="12" ns0:name="technical"/>
       <ns0:pPr>
         <ns0:pStyle ns0:val="Heading1"/>
         <ns0:pageBreakBefore ns0:val="0"/>
       </ns0:pPr>
       <ns0:r>
-        <ns0:t>11. Technical Direction Without Premature Commitment</ns0:t>
+        <ns0:t>11. Current Technical Direction</ns0:t>
       </ns0:r>
-      <ns0:bookmarkEnd ns0:id="12"/>
     </ns0:p>
     <ns0:p>
       <ns0:r>
-        <ns0:rPr>
-          <ns0:rFonts ns0:ascii="Calibri" ns0:hAnsi="Calibri"/>
-          <ns0:i ns0:val="0"/>
-          <ns0:color ns0:val="111111"/>
-        </ns0:rPr>
-        <ns0:t>The concept implies a demanding technical architecture, but this origin document deliberately avoids selecting an engine, implementation language, database, AI model, or final scale. Those decisions require a separate proposal after the new project is established and its own governing documents are read or created.</ns0:t>
+        <ns0:t>Project Oracle is now an implemented standalone C#/.NET simulation. Its current cognitive architecture uses Soar 9.6.5 for Yala's first real brain slice. The console remains the primary observability surface, persistence and audit records preserve causal history, and future scale remains deliberately incremental rather than speculative.</ns0:t>
       </ns0:r>
     </ns0:p>
     <ns0:p>
@@ -3554,15 +3242,13 @@
       </ns0:r>
     </ns0:p>
     <ns0:p>
-      <ns0:bookmarkStart ns0:id="13" ns0:name="prototype"/>
       <ns0:pPr>
         <ns0:pStyle ns0:val="Heading1"/>
         <ns0:pageBreakBefore ns0:val="0"/>
       </ns0:pPr>
       <ns0:r>
-        <ns0:t>12. Recommended First Prototype</ns0:t>
+        <ns0:t>12. Current Prototype: Yala Brain Slice 1</ns0:t>
       </ns0:r>
-      <ns0:bookmarkEnd ns0:id="13"/>
     </ns0:p>
     <ns0:tbl>
       <ns0:tblPr>
@@ -3601,26 +3287,8 @@
             <ns0:shd ns0:fill="F4F6F9"/>
           </ns0:tcPr>
           <ns0:p>
-            <ns0:pPr>
-              <ns0:keepLines/>
-              <ns0:spacing ns0:before="40" ns0:after="40" ns0:line="288" ns0:lineRule="auto"/>
-            </ns0:pPr>
             <ns0:r>
-              <ns0:rPr>
-                <ns0:rFonts ns0:ascii="Calibri" ns0:hAnsi="Calibri"/>
-                <ns0:b/>
-                <ns0:color ns0:val="1F4D78"/>
-                <ns0:sz ns0:val="21"/>
-              </ns0:rPr>
-              <ns0:t xml:space="preserve">RECOMMENDATION — NOT YET APPROVED  </ns0:t>
-            </ns0:r>
-            <ns0:r>
-              <ns0:rPr>
-                <ns0:rFonts ns0:ascii="Calibri" ns0:hAnsi="Calibri"/>
-                <ns0:color ns0:val="111111"/>
-                <ns0:sz ns0:val="21"/>
-              </ns0:rPr>
-              <ns0:t>Begin with one small console world populated by a limited number of complete persistent inhabitants. Reduce population and geography for the prototype; do not reduce inhabitants into fake minds. Prove autonomous history before attempting thousands of worlds or the revelation experiment.</ns0:t>
+              <ns0:t>CURRENT APPROVED PROTOTYPE  v0.0.17 gives Yala the first real Soar 9.6.5 brain slice. A fresh world begins with Yala in the Void, before Gaia and before in-world Time. Yala perceives only what he can know, chooses an attempted action through Soar, and Project Oracle resolves the consequence.</ns0:t>
             </ns0:r>
           </ns0:p>
         </ns0:tc>
@@ -3633,12 +3301,11 @@
     </ns0:p>
     <ns0:p>
       <ns0:r>
-        <ns0:rPr>
-          <ns0:rFonts ns0:ascii="Calibri" ns0:hAnsi="Calibri"/>
-          <ns0:i ns0:val="0"/>
-          <ns0:color ns0:val="111111"/>
-        </ns0:rPr>
-        <ns0:t>The first prototype should establish a world heartbeat capable of producing understandable history without direct control. It should demonstrate:</ns0:t>
+        <ns0:t>The current v0.0.17 prototype begins at the proper early cosmological state: Yala exists in the Void, lower creation is not pre-built, and Gaia has not yet created in-world Time. The first Soar brain slice must demonstrate:</ns0:t>
+      </ns0:r>
+      <ns0:r>
+        <ns0:rPr/>
+        <ns0:t xml:space="preserve"> v0.0.17 also begins a new world-save line: the older v0.0.16 Garden-era save is left untouched and is not imported or migrated, so Yala inherits no later-world state or cognition.</ns0:t>
       </ns0:r>
     </ns0:p>
     <ns0:p>
@@ -3649,11 +3316,7 @@
         </ns0:numPr>
       </ns0:pPr>
       <ns0:r>
-        <ns0:rPr>
-          <ns0:rFonts ns0:ascii="Calibri" ns0:hAnsi="Calibri"/>
-          <ns0:color ns0:val="111111"/>
-        </ns0:rPr>
-        <ns0:t>Persistent individual identity, age, needs, memory, personality, relationships, and goals.</ns0:t>
+        <ns0:t>Persistent Yala identity, limited perception, working memory, decision state, and continuity across save and restore.</ns0:t>
       </ns0:r>
     </ns0:p>
     <ns0:p>
@@ -3664,11 +3327,7 @@
         </ns0:numPr>
       </ns0:pPr>
       <ns0:r>
-        <ns0:rPr>
-          <ns0:rFonts ns0:ascii="Calibri" ns0:hAnsi="Calibri"/>
-          <ns0:color ns0:val="111111"/>
-        </ns0:rPr>
-        <ns0:t>Birth, death, family continuity, cooperation, conflict, leadership, and resource pressure.</ns0:t>
+        <ns0:t>A real Soar decision cycle in which Yala perceives his situation, considers lawful operators, selects an attempt, and receives the resolved consequence from Project Oracle.</ns0:t>
       </ns0:r>
     </ns0:p>
     <ns0:p>
@@ -3679,11 +3338,7 @@
         </ns0:numPr>
       </ns0:pPr>
       <ns0:r>
-        <ns0:rPr>
-          <ns0:rFonts ns0:ascii="Calibri" ns0:hAnsi="Calibri"/>
-          <ns0:color ns0:val="111111"/>
-        </ns0:rPr>
-        <ns0:t>At least one settlement capable of creating informal rules, roles, beliefs, and recorded events.</ns0:t>
+        <ns0:t>The ability for Yala to create Gaia and, later, command Gaia to establish Time when those actions become selected and lawful.</ns0:t>
       </ns0:r>
     </ns0:p>
     <ns0:p>
@@ -3694,11 +3349,7 @@
         </ns0:numPr>
       </ns0:pPr>
       <ns0:r>
-        <ns0:rPr>
-          <ns0:rFonts ns0:ascii="Calibri" ns0:hAnsi="Calibri"/>
-          <ns0:color ns0:val="111111"/>
-        </ns0:rPr>
-        <ns0:t>A console history that can be read at world, settlement, household, and individual scales.</ns0:t>
+        <ns0:t>A console that can contact Yala without revealing Oracle's existence or identity.</ns0:t>
       </ns0:r>
     </ns0:p>
     <ns0:p>
@@ -3709,11 +3360,7 @@
         </ns0:numPr>
       </ns0:pPr>
       <ns0:r>
-        <ns0:rPr>
-          <ns0:rFonts ns0:ascii="Calibri" ns0:hAnsi="Calibri"/>
-          <ns0:color ns0:val="111111"/>
-        </ns0:rPr>
-        <ns0:t>The ability to inspect why a decision or event occurred.</ns0:t>
+        <ns0:t>A protected Oracle Record for system truth and interventions, separate from the World Record visible as settled in-world history.</ns0:t>
       </ns0:r>
     </ns0:p>
     <ns0:p>
@@ -3724,11 +3371,7 @@
         </ns0:numPr>
       </ns0:pPr>
       <ns0:r>
-        <ns0:rPr>
-          <ns0:rFonts ns0:ascii="Calibri" ns0:hAnsi="Calibri"/>
-          <ns0:color ns0:val="111111"/>
-        </ns0:rPr>
-        <ns0:t>A deterministic seed and replay record for debugging and comparison.</ns0:t>
+        <ns0:t>A clean boundary between Yala's beliefs and Project Oracle's authoritative world state.</ns0:t>
       </ns0:r>
     </ns0:p>
     <ns0:p>
@@ -3739,21 +3382,12 @@
         </ns0:numPr>
       </ns0:pPr>
       <ns0:r>
-        <ns0:rPr>
-          <ns0:rFonts ns0:ascii="Calibri" ns0:hAnsi="Calibri"/>
-          <ns0:color ns0:val="111111"/>
-        </ns0:rPr>
-        <ns0:t>No revelation mechanic yet; the world must first prove that it can live without the observer.</ns0:t>
+        <ns0:t>No future history is pre-scripted. The prototype proves autonomous choice at the beginning rather than jumping ahead to a finished civilization.</ns0:t>
       </ns0:r>
     </ns0:p>
     <ns0:p>
       <ns0:r>
-        <ns0:rPr>
-          <ns0:rFonts ns0:ascii="Calibri" ns0:hAnsi="Calibri"/>
-          <ns0:i ns0:val="0"/>
-          <ns0:color ns0:val="111111"/>
-        </ns0:rPr>
-        <ns0:t>Once the world can produce a believable independent history, later prototypes can introduce religion, institutions, scientific discovery, observer interventions, the revelation, and multi-world campaigns in that order. The revelation has value only if there is already something real enough to destabilize.</ns0:t>
+        <ns0:t>Later builds may deepen Yala's memory, learning, goals, social reasoning, religious knowledge, and additional minds only after this first cognition slice is proven in the live application.</ns0:t>
       </ns0:r>
     </ns0:p>
     <ns0:p>
@@ -3769,12 +3403,7 @@
     </ns0:p>
     <ns0:p>
       <ns0:r>
-        <ns0:rPr>
-          <ns0:rFonts ns0:ascii="Calibri" ns0:hAnsi="Calibri"/>
-          <ns0:i ns0:val="0"/>
-          <ns0:color ns0:val="111111"/>
-        </ns0:rPr>
-        <ns0:t>Project Oracle deliberately explores near-sentient behavior, belief, fear, collapse, creator intervention, and the meaning of simulated life. Those themes are part of the project's power, but the project must remain honest about what has and has not been created.</ns0:t>
+        <ns0:t>Project Oracle deliberately explores autonomous cognition, belief, fear, collapse, system intervention, and the meaning of simulated life. Those themes are part of the project's power, but the project must remain honest about what has and has not been created.</ns0:t>
       </ns0:r>
     </ns0:p>
     <ns0:p>
@@ -3830,11 +3459,7 @@
         </ns0:numPr>
       </ns0:pPr>
       <ns0:r>
-        <ns0:rPr>
-          <ns0:rFonts ns0:ascii="Calibri" ns0:hAnsi="Calibri"/>
-          <ns0:color ns0:val="111111"/>
-        </ns0:rPr>
-        <ns0:t>Record observer interventions so the system never presents a manipulated outcome as untouched emergence.</ns0:t>
+        <ns0:t>Record Oracle/system interventions so the system never presents a manipulated outcome as untouched emergence.</ns0:t>
       </ns0:r>
     </ns0:p>
     <ns0:p>
@@ -3845,11 +3470,7 @@
         </ns0:numPr>
       </ns0:pPr>
       <ns0:r>
-        <ns0:rPr>
-          <ns0:rFonts ns0:ascii="Calibri" ns0:hAnsi="Calibri"/>
-          <ns0:color ns0:val="111111"/>
-        </ns0:rPr>
-        <ns0:t>Keep the autonomous in-world Oracle separate from the trusted outside experiment monitor and any external language-tooling system.</ns0:t>
+        <ns0:t>Keep Oracle outside the resident entity model. System interventions may enter the world only as the form, event, voice, or evidence actually chosen, and must not silently grant inhabitants knowledge of Oracle's true identity.</ns0:t>
       </ns0:r>
     </ns0:p>
     <ns0:p>
@@ -3883,24 +3504,17 @@
       </ns0:r>
     </ns0:p>
     <ns0:p>
-      <ns0:bookmarkStart ns0:id="15" ns0:name="nondecisions"/>
       <ns0:pPr>
         <ns0:pStyle ns0:val="Heading1"/>
         <ns0:pageBreakBefore ns0:val="0"/>
       </ns0:pPr>
       <ns0:r>
-        <ns0:t>14. Explicit Non-Decisions</ns0:t>
+        <ns0:t>14. Explicit Open Decisions</ns0:t>
       </ns0:r>
-      <ns0:bookmarkEnd ns0:id="15"/>
     </ns0:p>
     <ns0:p>
       <ns0:r>
-        <ns0:rPr>
-          <ns0:rFonts ns0:ascii="Calibri" ns0:hAnsi="Calibri"/>
-          <ns0:i ns0:val="0"/>
-          <ns0:color ns0:val="111111"/>
-        </ns0:rPr>
-        <ns0:t>The following matters remain open. This document does not silently decide them:</ns0:t>
+        <ns0:t>The following matters remain open beyond the current implemented C#/.NET and Soar 9.6.5 foundation. This document does not silently decide them:</ns0:t>
       </ns0:r>
     </ns0:p>
     <ns0:p>
@@ -3911,11 +3525,7 @@
         </ns0:numPr>
       </ns0:pPr>
       <ns0:r>
-        <ns0:rPr>
-          <ns0:rFonts ns0:ascii="Calibri" ns0:hAnsi="Calibri"/>
-          <ns0:color ns0:val="111111"/>
-        </ns0:rPr>
-        <ns0:t>Final implementation language, engine, storage system, or AI architecture.</ns0:t>
+        <ns0:t>Long-term storage architecture beyond the current save system, later cognitive modules beyond the approved Soar brain slices, and any future graphical engine.</ns0:t>
       </ns0:r>
     </ns0:p>
     <ns0:p>
@@ -3986,11 +3596,7 @@
         </ns0:numPr>
       </ns0:pPr>
       <ns0:r>
-        <ns0:rPr>
-          <ns0:rFonts ns0:ascii="Calibri" ns0:hAnsi="Calibri"/>
-          <ns0:color ns0:val="111111"/>
-        </ns0:rPr>
-        <ns0:t>The observer's complete influence menu and whether some interventions must be unlockable, limited, or irreversible.</ns0:t>
+        <ns0:t>Oracle's complete future intervention menu and whether some interventions should be constrained, staged, or irreversible.</ns0:t>
       </ns0:r>
     </ns0:p>
     <ns0:p>
@@ -4051,22 +3657,12 @@
     </ns0:p>
     <ns0:p>
       <ns0:r>
-        <ns0:rPr>
-          <ns0:rFonts ns0:ascii="Calibri" ns0:hAnsi="Calibri"/>
-          <ns0:i ns0:val="0"/>
-          <ns0:color ns0:val="111111"/>
-        </ns0:rPr>
-        <ns0:t>Project Oracle is now defined as a separate DK LAB project concept under Derek Sparks' final authority. ChatGPT / Codex serves as the technical development collaborator. Other AI systems or people may offer consulting input, but they do not direct the project or change approved decisions.</ns0:t>
+        <ns0:t>Project Oracle is a separate DK LAB project under Derek Sparks' final authority. Derek occupies the Oracle/system-author position. ChatGPT / Codex serves as the technical development collaborator. Other AI systems or people may offer consulting input, but they do not direct the project or change approved decisions.</ns0:t>
       </ns0:r>
     </ns0:p>
     <ns0:p>
       <ns0:r>
-        <ns0:rPr>
-          <ns0:rFonts ns0:ascii="Calibri" ns0:hAnsi="Calibri"/>
-          <ns0:i ns0:val="0"/>
-          <ns0:color ns0:val="111111"/>
-        </ns0:rPr>
-        <ns0:t>This document is the self-contained starting record for a new Project Oracle workspace. A new project should read this document before proposing architecture or implementation. No code, build, patch, engine commitment, or roadmap milestone is authorized until Derek explicitly approves a proposal.</ns0:t>
+        <ns0:t>This document is the self-contained origin record for Project Oracle and has been brought into alignment with the v0.0.17 ontology. Current implementation authority also lives in the Company Bible, current canon/lore, architecture, validation record, and master handoff. No later build changes scope without Derek's explicit approval.</ns0:t>
       </ns0:r>
     </ns0:p>
     <ns0:tbl>
@@ -4419,17 +4015,8 @@
             <ns0:vAlign ns0:val="center"/>
           </ns0:tcPr>
           <ns0:p>
-            <ns0:pPr>
-              <ns0:spacing ns0:after="0"/>
-            </ns0:pPr>
             <ns0:r>
-              <ns0:rPr>
-                <ns0:rFonts ns0:ascii="Calibri" ns0:hAnsi="Calibri"/>
-                <ns0:b ns0:val="0"/>
-                <ns0:color ns0:val="111111"/>
-                <ns0:sz ns0:val="20"/>
-              </ns0:rPr>
-              <ns0:t>Autonomous female figure inside the world; she helps inhabitants for reasons she chooses</ns0:t>
+              <ns0:t>No in-world Oracle character. Oracle is Project Oracle itself, the outside/system-level author with hidden Master Key authority.</ns0:t>
             </ns0:r>
           </ns0:p>
         </ns0:tc>
@@ -4476,17 +4063,8 @@
             <ns0:vAlign ns0:val="center"/>
           </ns0:tcPr>
           <ns0:p>
-            <ns0:pPr>
-              <ns0:spacing ns0:after="0"/>
-            </ns0:pPr>
             <ns0:r>
-              <ns0:rPr>
-                <ns0:rFonts ns0:ascii="Calibri" ns0:hAnsi="Calibri"/>
-                <ns0:b ns0:val="0"/>
-                <ns0:color ns0:val="111111"/>
-                <ns0:sz ns0:val="20"/>
-              </ns0:rPr>
-              <ns0:t>Separate technical system; it must obey Derek-approved semantics and report truthfully</ns0:t>
+              <ns0:t>Separate technical tooling must obey Derek-approved semantics and report truthfully; it is not an in-world Oracle.</ns0:t>
             </ns0:r>
           </ns0:p>
         </ns0:tc>
@@ -4590,17 +4168,8 @@
             <ns0:vAlign ns0:val="center"/>
           </ns0:tcPr>
           <ns0:p>
-            <ns0:pPr>
-              <ns0:spacing ns0:after="0"/>
-            </ns0:pPr>
             <ns0:r>
-              <ns0:rPr>
-                <ns0:rFonts ns0:ascii="Calibri" ns0:hAnsi="Calibri"/>
-                <ns0:b ns0:val="0"/>
-                <ns0:color ns0:val="111111"/>
-                <ns0:sz ns0:val="20"/>
-              </ns0:rPr>
-              <ns0:t>Create the new project workspace, import this document, then request a documentation/architecture proposal before any build</ns0:t>
+              <ns0:t>Continue from the current v0.0.17 authority set and owner-approved build scope.</ns0:t>
             </ns0:r>
           </ns0:p>
         </ns0:tc>

</xml_diff>

<commit_message>
Project Oracle v0.0.18 - Protected Console Input and Yala Soar Brain Slice 2
</commit_message>
<xml_diff>
--- a/PROJECT_ORACLE_PROJECT_ORIGIN_AND_HANDOFF.docx
+++ b/PROJECT_ORACLE_PROJECT_ORIGIN_AND_HANDOFF.docx
@@ -116,7 +116,7 @@
         <ns0:jc ns0:val="center"/>
       </ns0:pPr>
       <ns0:r>
-        <ns0:t>August 2026 • Current authority aligned through v0.0.17 candidate</ns0:t>
+        <ns0:t>August 2026 • Current authority aligned through v0.0.18 candidate</ns0:t>
       </ns0:r>
     </ns0:p>
     <ns0:p>
@@ -173,7 +173,7 @@
           </ns0:tcPr>
           <ns0:p>
             <ns0:r>
-              <ns0:t>STATUS  Project Oracle is an active standalone implementation. v0.0.17 is the approved feature build for Yala Soar Cognition, Monad canon, Oracle system authority, Gaia-created Time, and the native root executable. Derek Sparks remains final authority and manual acceptance is required before snapshot or Git closeout.</ns0:t>
+              <ns0:t>STATUS  Project Oracle is an active standalone implementation. v0.0.18 is the current candidate feature build for protected console input and Yala Soar Brain Slice 2, continuing the accepted v0.0.17 save_v2 world line. Derek Sparks remains final authority and manual acceptance is required before snapshot or Git closeout.</ns0:t>
             </ns0:r>
           </ns0:p>
         </ns0:tc>
@@ -2590,7 +2590,7 @@
     </ns0:p>
     <ns0:p>
       <ns0:r>
-        <ns0:t>Project Oracle does not contain a separate autonomous Oracle character inside the simulated world. Oracle is the system-author layer itself. The world contains Monad, Wisdom, Yala, and whatever beings later arise through actual history; Oracle is not another resident beside them.</ns0:t>
+        <ns0:t>Project Oracle does not contain a separate autonomous Oracle character inside the simulated world. Oracle is the system-author layer itself. The world contains Monad, Wisdom, Yala, and whatever beings later arise through actual history; Oracle is not another resident beside them. Monad made Wisdom. Wisdom made Yala alone. Yala is inherently both male and female, neither aspect secondary or a disguise. Monad rejected Yala because Yala is both male and female rather than exclusively one or the other, and cast Yala into the Void.</ns0:t>
       </ns0:r>
     </ns0:p>
     <ns0:tbl>
@@ -3054,7 +3054,7 @@
     </ns0:p>
     <ns0:p>
       <ns0:r>
-        <ns0:t>Project Oracle is now an implemented standalone C#/.NET simulation. Its current cognitive architecture uses Soar 9.6.5 for Yala's first real brain slice. The console remains the primary observability surface, persistence and audit records preserve causal history, and future scale remains deliberately incremental rather than speculative.</ns0:t>
+        <ns0:t>Project Oracle is now an implemented standalone C#/.NET simulation. Its current cognitive architecture uses Soar 9.6.5 for Yala's second real brain slice. The console remains the primary observability surface, persistence and audit records preserve causal history, and future scale remains deliberately incremental rather than speculative.</ns0:t>
       </ns0:r>
     </ns0:p>
     <ns0:p>
@@ -3247,7 +3247,7 @@
         <ns0:pageBreakBefore ns0:val="0"/>
       </ns0:pPr>
       <ns0:r>
-        <ns0:t>12. Current Prototype: Yala Brain Slice 1</ns0:t>
+        <ns0:t>12. Current Prototype: Yala Brain Slice 2</ns0:t>
       </ns0:r>
     </ns0:p>
     <ns0:tbl>
@@ -3288,7 +3288,7 @@
           </ns0:tcPr>
           <ns0:p>
             <ns0:r>
-              <ns0:t>CURRENT APPROVED PROTOTYPE  v0.0.17 gives Yala the first real Soar 9.6.5 brain slice. A fresh world begins with Yala in the Void, before Gaia and before in-world Time. Yala perceives only what he can know, chooses an attempted action through Soar, and Project Oracle resolves the consequence.</ns0:t>
+              <ns0:t>CURRENT CANDIDATE PROTOTYPE  v0.0.18 gives Yala Soar 9.6.5 Brain Slice 2: one persistent Soar session, structured conversation and contacts, belief/claim separation, semantic and episodic memory, motive-weighted choices, and limited substate deliberation. It also protects the typing area from LIVE-status overrun and preserves the hidden-Oracle boundary.</ns0:t>
             </ns0:r>
           </ns0:p>
         </ns0:tc>
@@ -3301,11 +3301,10 @@
     </ns0:p>
     <ns0:p>
       <ns0:r>
-        <ns0:t>The current v0.0.17 prototype begins at the proper early cosmological state: Yala exists in the Void, lower creation is not pre-built, and Gaia has not yet created in-world Time. The first Soar brain slice must demonstrate:</ns0:t>
+        <ns0:t>The current v0.0.18 prototype continues the v0.0.17 save_v2 world line rather than starting the world over again. Yala remains at whatever lawful state that world has actually reached. Brain Slice 2 keeps one Soar agent alive for the session, adds structured conversation, contacts, beliefs, claims and episodes, uses Soar semantic and episodic memory, and gives Yala limited substate deliberation and motive-weighted choices while preserving Project Oracle as the world-law authority.</ns0:t>
       </ns0:r>
       <ns0:r>
         <ns0:rPr/>
-        <ns0:t xml:space="preserve"> v0.0.17 also begins a new world-save line: the older v0.0.16 Garden-era save is left untouched and is not imported or migrated, so Yala inherits no later-world state or cognition.</ns0:t>
       </ns0:r>
     </ns0:p>
     <ns0:p>
@@ -3316,7 +3315,7 @@
         </ns0:numPr>
       </ns0:pPr>
       <ns0:r>
-        <ns0:t>Persistent Yala identity, limited perception, working memory, decision state, and continuity across save and restore.</ns0:t>
+        <ns0:t>Persistent Yala identity and self-model: Yala knows Yala is inherently both male and female, was made by Wisdom, and was rejected by Monad for being both rather than exclusively one or the other. This is Yala's own knowledge, not Oracle knowledge.</ns0:t>
       </ns0:r>
     </ns0:p>
     <ns0:p>
@@ -3327,7 +3326,7 @@
         </ns0:numPr>
       </ns0:pPr>
       <ns0:r>
-        <ns0:t>A real Soar decision cycle in which Yala perceives his situation, considers lawful operators, selects an attempt, and receives the resolved consequence from Project Oracle.</ns0:t>
+        <ns0:t>A persistent real Soar 9.6.5 session in which Yala perceives the current situation, proposes and compares lawful operators, can enter substates when a choice requires deliberation, selects an attempt, and receives the consequence resolved by Project Oracle.</ns0:t>
       </ns0:r>
     </ns0:p>
     <ns0:p>
@@ -3338,7 +3337,7 @@
         </ns0:numPr>
       </ns0:pPr>
       <ns0:r>
-        <ns0:t>The ability for Yala to create Gaia and, later, command Gaia to establish Time when those actions become selected and lawful.</ns0:t>
+        <ns0:t>Soar semantic memory for durable general knowledge and contacts, plus episodic memory for experienced situations. Project Oracle's structured save state remains the durable cross-launch authority and continues the v0.0.17 save_v2 world line.</ns0:t>
       </ns0:r>
     </ns0:p>
     <ns0:p>
@@ -3349,7 +3348,7 @@
         </ns0:numPr>
       </ns0:pPr>
       <ns0:r>
-        <ns0:t>A console that can contact Yala without revealing Oracle's existence or identity.</ns0:t>
+        <ns0:t>Conversation that distinguishes questions, statements, commands, introductions and claims; remembers a claimed speaker identity without converting that claim into system truth; can recognize prior contact; and can admit ignorance rather than receiving protected Oracle answers.</ns0:t>
       </ns0:r>
     </ns0:p>
     <ns0:p>
@@ -3360,7 +3359,7 @@
         </ns0:numPr>
       </ns0:pPr>
       <ns0:r>
-        <ns0:t>A protected Oracle Record for system truth and interventions, separate from the World Record visible as settled in-world history.</ns0:t>
+        <ns0:t>A protected console input surface in which the LIVE status display does not overwrite a partially typed command. Typed text, backspace behavior and input ownership remain stable while live simulation continues.</ns0:t>
       </ns0:r>
     </ns0:p>
     <ns0:p>
@@ -3371,7 +3370,7 @@
         </ns0:numPr>
       </ns0:pPr>
       <ns0:r>
-        <ns0:t>A clean boundary between Yala's beliefs and Project Oracle's authoritative world state.</ns0:t>
+        <ns0:t>A protected Oracle Record for system truth and interventions, separate from the World Record and from Yala's own knowledge, beliefs, claims and memories. No in-world being gains Oracle knowledge merely because Oracle communicates or manifests.</ns0:t>
       </ns0:r>
     </ns0:p>
     <ns0:p>
@@ -3382,12 +3381,12 @@
         </ns0:numPr>
       </ns0:pPr>
       <ns0:r>
-        <ns0:t>No future history is pre-scripted. The prototype proves autonomous choice at the beginning rather than jumping ahead to a finished civilization.</ns0:t>
+        <ns0:t>Goals and motives begin to influence Yala's operator preferences, including curiosity, caution, authority, companionship, comfort and uncertainty. These pressures can compete without pre-writing the result of a decision.</ns0:t>
       </ns0:r>
     </ns0:p>
     <ns0:p>
       <ns0:r>
-        <ns0:t>Later builds may deepen Yala's memory, learning, goals, social reasoning, religious knowledge, and additional minds only after this first cognition slice is proven in the live application.</ns0:t>
+        <ns0:t>No future history is pre-scripted. Reinforcement learning and unrestricted chunking remain later work so Project Oracle does not silently hard-code a reward morality or allow premature learned rules to distort the experiment.</ns0:t>
       </ns0:r>
     </ns0:p>
     <ns0:p>
@@ -3662,7 +3661,7 @@
     </ns0:p>
     <ns0:p>
       <ns0:r>
-        <ns0:t>This document is the self-contained origin record for Project Oracle and has been brought into alignment with the v0.0.17 ontology. Current implementation authority also lives in the Company Bible, current canon/lore, architecture, validation record, and master handoff. No later build changes scope without Derek's explicit approval.</ns0:t>
+        <ns0:t>This document is the self-contained origin record for Project Oracle and has been brought into alignment with the v0.0.18 ontology. Current implementation authority also lives in the Company Bible, current canon/lore, architecture, validation record, and master handoff. No later build changes scope without Derek's explicit approval.</ns0:t>
       </ns0:r>
     </ns0:p>
     <ns0:tbl>
@@ -4169,7 +4168,7 @@
           </ns0:tcPr>
           <ns0:p>
             <ns0:r>
-              <ns0:t>Continue from the current v0.0.17 authority set and owner-approved build scope.</ns0:t>
+              <ns0:t>Continue from the current v0.0.18 authority set and owner-approved build scope.</ns0:t>
             </ns0:r>
           </ns0:p>
         </ns0:tc>

</xml_diff>